<commit_message>
docs: update EUC response draft
</commit_message>
<xml_diff>
--- a/EUC_Response_Draft.docx
+++ b/EUC_Response_Draft.docx
@@ -94,7 +94,7 @@
     </w:p>
     <w:p>
       <w:pPr>
-        <w:spacing w:before="280" w:after="80"/>
+        <w:spacing w:before="320" w:after="80"/>
       </w:pPr>
       <w:r>
         <w:rPr>
@@ -211,6 +211,20 @@
     <w:p/>
     <w:p>
       <w:pPr>
+        <w:spacing w:after="160" w:before="0"/>
+      </w:pPr>
+      <w:r>
+        <w:rPr>
+          <w:rFonts w:ascii="Calibri" w:hAnsi="Calibri"/>
+          <w:b w:val="0"/>
+          <w:i w:val="0"/>
+          <w:sz w:val="22"/>
+        </w:rPr>
+        <w:t>There is also a subtler but equally important gap: the existing lists carry no machine-readable version rules. EUC's approvals are version-aware — software is approved at a version floor, meaning "this version and above" — but that constraint exists only as text written for a person to read. No system today can evaluate it at the point of a request. A user asking for an outdated or vulnerable version of approved software receives no different response than one asking for a current one. This is not a process failure; it is a data structure problem, and it is one of the core things the new catalog design is built to solve.</w:t>
+      </w:r>
+    </w:p>
+    <w:p>
+      <w:pPr>
         <w:spacing w:after="280" w:before="0"/>
       </w:pPr>
       <w:r>
@@ -238,12 +252,12 @@
           <w:i w:val="0"/>
           <w:sz w:val="22"/>
         </w:rPr>
-        <w:t xml:space="preserve"> — one that manages approval state, packaging state, and publishing state as a single record of truth — is one of the foundational problems this initiative set out to solve. Everything else depends on it.</w:t>
+        <w:t xml:space="preserve"> — one that manages approval state, version constraints, packaging state, and publishing state as a single record of truth — is one of the foundational problems this initiative set out to solve. Everything else depends on it.</w:t>
       </w:r>
     </w:p>
     <w:p>
       <w:pPr>
-        <w:spacing w:before="280" w:after="80"/>
+        <w:spacing w:before="320" w:after="80"/>
       </w:pPr>
       <w:r>
         <w:rPr>
@@ -267,7 +281,7 @@
           <w:i w:val="0"/>
           <w:sz w:val="22"/>
         </w:rPr>
-        <w:t>We want to be transparent about where we are and where we are headed.</w:t>
+        <w:t>We want to be transparent about where we are and where we are headed — including why the ServiceNow path did not work, because the reason matters for what comes next.</w:t>
       </w:r>
     </w:p>
     <w:p>
@@ -281,7 +295,111 @@
           <w:i w:val="0"/>
           <w:sz w:val="22"/>
         </w:rPr>
-        <w:t>The ServiceNow team has confirmed they are unable to deliver the required software catalog functionality within the timeframe we need. A catalog that is version-aware, connected to the request workflow, and integrated with packaging and publishing state is not something ServiceNow can provide on the required timeline.</w:t>
+        <w:t xml:space="preserve">The constraint is not one of delivery pace or resourcing. It is structural. ServiceNow's software governance model attaches decisions to a title. EUC's requirement attaches to a version — specifically, whether the version being requested meets an approved version floor. The platform's version condition supports only four operators: </w:t>
+      </w:r>
+      <w:r>
+        <w:rPr>
+          <w:rFonts w:ascii="Calibri" w:hAnsi="Calibri"/>
+          <w:b w:val="0"/>
+          <w:i/>
+          <w:sz w:val="22"/>
+        </w:rPr>
+        <w:t>is</w:t>
+      </w:r>
+      <w:r>
+        <w:rPr>
+          <w:rFonts w:ascii="Calibri" w:hAnsi="Calibri"/>
+          <w:b w:val="0"/>
+          <w:i w:val="0"/>
+          <w:sz w:val="22"/>
+        </w:rPr>
+        <w:t xml:space="preserve">, </w:t>
+      </w:r>
+      <w:r>
+        <w:rPr>
+          <w:rFonts w:ascii="Calibri" w:hAnsi="Calibri"/>
+          <w:b w:val="0"/>
+          <w:i/>
+          <w:sz w:val="22"/>
+        </w:rPr>
+        <w:t>starts with</w:t>
+      </w:r>
+      <w:r>
+        <w:rPr>
+          <w:rFonts w:ascii="Calibri" w:hAnsi="Calibri"/>
+          <w:b w:val="0"/>
+          <w:i w:val="0"/>
+          <w:sz w:val="22"/>
+        </w:rPr>
+        <w:t xml:space="preserve">, </w:t>
+      </w:r>
+      <w:r>
+        <w:rPr>
+          <w:rFonts w:ascii="Calibri" w:hAnsi="Calibri"/>
+          <w:b w:val="0"/>
+          <w:i/>
+          <w:sz w:val="22"/>
+        </w:rPr>
+        <w:t>is anything</w:t>
+      </w:r>
+      <w:r>
+        <w:rPr>
+          <w:rFonts w:ascii="Calibri" w:hAnsi="Calibri"/>
+          <w:b w:val="0"/>
+          <w:i w:val="0"/>
+          <w:sz w:val="22"/>
+        </w:rPr>
+        <w:t xml:space="preserve">, and </w:t>
+      </w:r>
+      <w:r>
+        <w:rPr>
+          <w:rFonts w:ascii="Calibri" w:hAnsi="Calibri"/>
+          <w:b w:val="0"/>
+          <w:i/>
+          <w:sz w:val="22"/>
+        </w:rPr>
+        <w:t>is empty</w:t>
+      </w:r>
+      <w:r>
+        <w:rPr>
+          <w:rFonts w:ascii="Calibri" w:hAnsi="Calibri"/>
+          <w:b w:val="0"/>
+          <w:i w:val="0"/>
+          <w:sz w:val="22"/>
+        </w:rPr>
+        <w:t xml:space="preserve">. There is no </w:t>
+      </w:r>
+      <w:r>
+        <w:rPr>
+          <w:rFonts w:ascii="Calibri" w:hAnsi="Calibri"/>
+          <w:b w:val="0"/>
+          <w:i/>
+          <w:sz w:val="22"/>
+        </w:rPr>
+        <w:t>greater than</w:t>
+      </w:r>
+      <w:r>
+        <w:rPr>
+          <w:rFonts w:ascii="Calibri" w:hAnsi="Calibri"/>
+          <w:b w:val="0"/>
+          <w:i w:val="0"/>
+          <w:sz w:val="22"/>
+        </w:rPr>
+        <w:t xml:space="preserve"> anywhere in the model. A rule reading "approved at 18.0.0 and above" has no native representation in ServiceNow, and that is the central requirement — not a nice-to-have. The platform simply cannot express it as a governed constraint.</w:t>
+      </w:r>
+    </w:p>
+    <w:p>
+      <w:pPr>
+        <w:spacing w:after="160" w:before="0"/>
+      </w:pPr>
+      <w:r>
+        <w:rPr>
+          <w:rFonts w:ascii="Calibri" w:hAnsi="Calibri"/>
+          <w:b w:val="0"/>
+          <w:i w:val="0"/>
+          <w:sz w:val="22"/>
+        </w:rPr>
+        <w:t>This is the finding from the technical build work done with the ServiceNow team, working against a real development instance with real data from your approved and denied lists. The constraint did not surface until software model records were created against actual titles, because nothing in the design phase required that step.</w:t>
       </w:r>
     </w:p>
     <w:p>
@@ -318,6 +436,52 @@
     </w:p>
     <w:p>
       <w:pPr>
+        <w:spacing w:after="160" w:before="0"/>
+      </w:pPr>
+      <w:r>
+        <w:rPr>
+          <w:rFonts w:ascii="Calibri" w:hAnsi="Calibri"/>
+          <w:b w:val="0"/>
+          <w:i w:val="0"/>
+          <w:sz w:val="22"/>
+        </w:rPr>
+        <w:t xml:space="preserve">The same build work that exposed the ServiceNow constraint also identified the right path forward. Rather than a native software model, the catalog can be held as a </w:t>
+      </w:r>
+      <w:r>
+        <w:rPr>
+          <w:rFonts w:ascii="Calibri" w:hAnsi="Calibri"/>
+          <w:b/>
+          <w:i w:val="0"/>
+          <w:sz w:val="22"/>
+        </w:rPr>
+        <w:t>structured flat table</w:t>
+      </w:r>
+      <w:r>
+        <w:rPr>
+          <w:rFonts w:ascii="Calibri" w:hAnsi="Calibri"/>
+          <w:b w:val="0"/>
+          <w:i w:val="0"/>
+          <w:sz w:val="22"/>
+        </w:rPr>
+        <w:t xml:space="preserve"> — each row representing a title, carrying its approval status, its version constraint as a readable rule, its packaging state, and its fulfillment path. A script evaluates the version rule at submission. "18.0.0 and above" stored as text is something a script can compare against; it is also the only approach that can express a version rule at all.</w:t>
+      </w:r>
+    </w:p>
+    <w:p>
+      <w:pPr>
+        <w:spacing w:after="160" w:before="0"/>
+      </w:pPr>
+      <w:r>
+        <w:rPr>
+          <w:rFonts w:ascii="Calibri" w:hAnsi="Calibri"/>
+          <w:b w:val="0"/>
+          <w:i w:val="0"/>
+          <w:sz w:val="22"/>
+        </w:rPr>
+        <w:t>This pattern has a working precedent inside Fiserv. The existing server and mainframe software approval solution — built and actively maintained by another team — uses exactly this structure: a flat table, with optional references to software models added incrementally over time rather than required up front. Their request path has worked throughout. We are not proposing something untested; we are proposing that EUC's workstation catalog follow the same approach that already governs the server estate.</w:t>
+      </w:r>
+    </w:p>
+    <w:p>
+      <w:pPr>
         <w:spacing w:after="120" w:before="0"/>
       </w:pPr>
       <w:r>
@@ -327,7 +491,7 @@
           <w:i w:val="0"/>
           <w:sz w:val="22"/>
         </w:rPr>
-        <w:t xml:space="preserve">Given the ServiceNow constraint, we are proposing a pivot to the </w:t>
+        <w:t xml:space="preserve">For the workflow and governance layer, we are proposing the </w:t>
       </w:r>
       <w:r>
         <w:rPr>
@@ -345,7 +509,7 @@
           <w:i w:val="0"/>
           <w:sz w:val="22"/>
         </w:rPr>
-        <w:t>: Microsoft Teams and Power Automate for the governance workflows, with SharePoint (or a similar structured store) as the software catalog data layer. This approach:</w:t>
+        <w:t xml:space="preserve"> — Microsoft Teams and Power Automate — as the platform for approval routing, notifications, and status tracking. This keeps the solution in tools your teams already use, removes the ServiceNow dependency, and allows us to move without waiting on a separate delivery timeline. This approach:</w:t>
       </w:r>
     </w:p>
     <w:p>
@@ -377,7 +541,7 @@
           <w:i w:val="0"/>
           <w:sz w:val="22"/>
         </w:rPr>
-        <w:t>Lets us build approval routing, ASL/DSL logic, and packaging state tracking without waiting on a ServiceNow delivery timeline</w:t>
+        <w:t>Expresses version-aware approval rules natively — something ServiceNow could not do</w:t>
       </w:r>
     </w:p>
     <w:p>
@@ -393,7 +557,23 @@
           <w:i w:val="0"/>
           <w:sz w:val="22"/>
         </w:rPr>
-        <w:t>Gives EUC direct visibility and ownership of the request experience</w:t>
+        <w:t>Lets us build approval routing, ASL/DSL logic, and packaging state tracking on our own schedule</w:t>
+      </w:r>
+    </w:p>
+    <w:p>
+      <w:pPr>
+        <w:pStyle w:val="ListBullet"/>
+        <w:spacing w:after="80" w:before="0"/>
+        <w:ind w:left="360"/>
+      </w:pPr>
+      <w:r>
+        <w:rPr>
+          <w:rFonts w:ascii="Calibri" w:hAnsi="Calibri"/>
+          <w:b w:val="0"/>
+          <w:i w:val="0"/>
+          <w:sz w:val="22"/>
+        </w:rPr>
+        <w:t>Gives EUC direct visibility and ownership of the catalog and request experience</w:t>
       </w:r>
     </w:p>
     <w:p>
@@ -424,7 +604,7 @@
           <w:i w:val="0"/>
           <w:sz w:val="22"/>
         </w:rPr>
-        <w:t xml:space="preserve">There are a few integration patterns worth evaluating together — for example, whether the catalog lives in a SharePoint List with Power Automate triggers, a Dataverse table connected to Teams, or a lightweight API behind the portal that aggregates from multiple Microsoft sources. We do not want to decide this unilaterally. </w:t>
+        <w:t xml:space="preserve">There are integration patterns worth evaluating together — SharePoint List with Power Automate triggers, a Dataverse table, or a lightweight API layer — and we do not want to decide that unilaterally. </w:t>
       </w:r>
       <w:r>
         <w:rPr>
@@ -433,7 +613,7 @@
           <w:i w:val="0"/>
           <w:sz w:val="22"/>
         </w:rPr>
-        <w:t>We would like to schedule a working session specifically to walk through the options and land on the right approach together.</w:t>
+        <w:t>We would like to schedule a working session specifically to walk through the options and agree the approach.</w:t>
       </w:r>
     </w:p>
     <w:p>
@@ -447,12 +627,12 @@
           <w:i w:val="0"/>
           <w:sz w:val="22"/>
         </w:rPr>
-        <w:t>The scenarios you asked to see — catalog validation at intake, the experience when software is already packaged, the denied software path, the net-new workflow, manual step removal — remain the design intent. The intake portal already demonstrates most of these. What we need to align on is how we connect it to live data.</w:t>
+        <w:t>The scenarios you asked to see — catalog validation at intake, the experience when software is already packaged, the denied software path, the net-new workflow, manual step removal — remain the design intent. The intake portal already demonstrates most of these. What we need to align on is the catalog data model and how we connect it to live governance.</w:t>
       </w:r>
     </w:p>
     <w:p>
       <w:pPr>
-        <w:spacing w:before="280" w:after="80"/>
+        <w:spacing w:before="320" w:after="80"/>
       </w:pPr>
       <w:r>
         <w:rPr>
@@ -852,7 +1032,7 @@
     </w:p>
     <w:p>
       <w:pPr>
-        <w:spacing w:before="280" w:after="80"/>
+        <w:spacing w:before="320" w:after="80"/>
       </w:pPr>
       <w:r>
         <w:rPr>
@@ -867,7 +1047,7 @@
     </w:p>
     <w:p>
       <w:pPr>
-        <w:spacing w:after="120" w:before="0"/>
+        <w:spacing w:after="160" w:before="0"/>
       </w:pPr>
       <w:r>
         <w:rPr>
@@ -1133,7 +1313,7 @@
           <w:i w:val="0"/>
           <w:sz w:val="22"/>
         </w:rPr>
-        <w:t xml:space="preserve"> — packagers cannot accidentally use outdated templates. The latest approved version with EUC-approved configuration is applied automatically. Existing v3 scripts are converted automatically — a conversion capability that is more robust than PSADT's own native tools and has been tested on the most complex real-world scripts.</w:t>
+        <w:t xml:space="preserve"> — packagers cannot accidentally use outdated templates. The latest approved version with EUC-approved configuration is applied automatically. Existing v3 scripts are converted automatically — a conversion capability more robust than PSADT's own tools, tested on the most complex real-world scripts.</w:t>
       </w:r>
     </w:p>
     <w:p>
@@ -1253,7 +1433,7 @@
     </w:p>
     <w:p>
       <w:pPr>
-        <w:spacing w:before="280" w:after="80"/>
+        <w:spacing w:before="320" w:after="80"/>
       </w:pPr>
       <w:r>
         <w:rPr>
@@ -1302,7 +1482,7 @@
           <w:i w:val="0"/>
           <w:sz w:val="22"/>
         </w:rPr>
-        <w:t>Walk through the proposed Teams / Power Automate approach to governance workflows and the software catalog model. We want your team's input on what the right data model looks like, how approval states should be managed, and what the requestor experience should feel like.</w:t>
+        <w:t>Walk through the proposed Teams / Power Automate approach to governance workflows and the software catalog model. We want your team's input on what the right data model looks like, how approval states and version constraints should be managed, and what the requestor experience should feel like.</w:t>
       </w:r>
     </w:p>
     <w:p>

</xml_diff>